<commit_message>
adding a new project. a mobile application, also updating the resume for that new application
</commit_message>
<xml_diff>
--- a/public/resume/Emmanuel_Ablao_ATS_Resume.docx
+++ b/public/resume/Emmanuel_Ablao_ATS_Resume.docx
@@ -42,7 +42,6 @@
         <w:spacing w:after="160"/>
         <w:jc w:val="center"/>
       </w:pPr>
-      <w:proofErr w:type="spellStart"/>
       <w:r>
         <w:rPr>
           <w:rFonts w:ascii="Calibri" w:eastAsia="Calibri" w:hAnsi="Calibri" w:cs="Calibri"/>
@@ -50,57 +49,7 @@
           <w:sz w:val="19"/>
           <w:szCs w:val="19"/>
         </w:rPr>
-        <w:t>Pililla</w:t>
-      </w:r>
-      <w:proofErr w:type="spellEnd"/>
-      <w:r>
-        <w:rPr>
-          <w:rFonts w:ascii="Calibri" w:eastAsia="Calibri" w:hAnsi="Calibri" w:cs="Calibri"/>
-          <w:color w:val="4B5563"/>
-          <w:sz w:val="19"/>
-          <w:szCs w:val="19"/>
-        </w:rPr>
-        <w:t xml:space="preserve">, Rizal, </w:t>
-      </w:r>
-      <w:proofErr w:type="gramStart"/>
-      <w:r>
-        <w:rPr>
-          <w:rFonts w:ascii="Calibri" w:eastAsia="Calibri" w:hAnsi="Calibri" w:cs="Calibri"/>
-          <w:color w:val="4B5563"/>
-          <w:sz w:val="19"/>
-          <w:szCs w:val="19"/>
-        </w:rPr>
-        <w:t>Philippines  |</w:t>
-      </w:r>
-      <w:proofErr w:type="gramEnd"/>
-      <w:r>
-        <w:rPr>
-          <w:rFonts w:ascii="Calibri" w:eastAsia="Calibri" w:hAnsi="Calibri" w:cs="Calibri"/>
-          <w:color w:val="4B5563"/>
-          <w:sz w:val="19"/>
-          <w:szCs w:val="19"/>
-        </w:rPr>
-        <w:t xml:space="preserve">  </w:t>
-      </w:r>
-      <w:proofErr w:type="gramStart"/>
-      <w:r>
-        <w:rPr>
-          <w:rFonts w:ascii="Calibri" w:eastAsia="Calibri" w:hAnsi="Calibri" w:cs="Calibri"/>
-          <w:color w:val="4B5563"/>
-          <w:sz w:val="19"/>
-          <w:szCs w:val="19"/>
-        </w:rPr>
-        <w:t>09519044954  |</w:t>
-      </w:r>
-      <w:proofErr w:type="gramEnd"/>
-      <w:r>
-        <w:rPr>
-          <w:rFonts w:ascii="Calibri" w:eastAsia="Calibri" w:hAnsi="Calibri" w:cs="Calibri"/>
-          <w:color w:val="4B5563"/>
-          <w:sz w:val="19"/>
-          <w:szCs w:val="19"/>
-        </w:rPr>
-        <w:t xml:space="preserve">  emmanuelablao16@gmail.com</w:t>
+        <w:t xml:space="preserve">Pililla, Rizal, Philippines  |  09519044954  |  emmanuelablao16@gmail.com</w:t>
       </w:r>
     </w:p>
     <w:p>
@@ -108,7 +57,7 @@
         <w:pBdr>
           <w:bottom w:val="single" w:sz="8" w:space="4" w:color="1F2937"/>
         </w:pBdr>
-        <w:spacing w:before="130" w:after="60"/>
+        <w:spacing w:before="100" w:after="40"/>
       </w:pPr>
       <w:r>
         <w:rPr>
@@ -132,43 +81,7 @@
           <w:sz w:val="19"/>
           <w:szCs w:val="19"/>
         </w:rPr>
-        <w:t>Full-Stack Developer and recent Information Technology graduate with hands-on, production experience building web, mobile, desktop, and IoT-integrated systems. Progressed from OJT intern to full-time IT Specialist within a single company after being absorbed for strong performance. Proficient in React, TypeScript, Node.js, and SQL/</w:t>
-      </w:r>
-      <w:proofErr w:type="spellStart"/>
-      <w:r>
-        <w:rPr>
-          <w:rFonts w:ascii="Calibri" w:eastAsia="Calibri" w:hAnsi="Calibri" w:cs="Calibri"/>
-          <w:sz w:val="19"/>
-          <w:szCs w:val="19"/>
-        </w:rPr>
-        <w:t>Supabase</w:t>
-      </w:r>
-      <w:proofErr w:type="spellEnd"/>
-      <w:r>
-        <w:rPr>
-          <w:rFonts w:ascii="Calibri" w:eastAsia="Calibri" w:hAnsi="Calibri" w:cs="Calibri"/>
-          <w:sz w:val="19"/>
-          <w:szCs w:val="19"/>
-        </w:rPr>
-        <w:t xml:space="preserve">, with experience deploying live production applications (SSL/DNS configuration, </w:t>
-      </w:r>
-      <w:proofErr w:type="spellStart"/>
-      <w:r>
-        <w:rPr>
-          <w:rFonts w:ascii="Calibri" w:eastAsia="Calibri" w:hAnsi="Calibri" w:cs="Calibri"/>
-          <w:sz w:val="19"/>
-          <w:szCs w:val="19"/>
-        </w:rPr>
-        <w:t>Hostinger</w:t>
-      </w:r>
-      <w:proofErr w:type="spellEnd"/>
-      <w:r>
-        <w:rPr>
-          <w:rFonts w:ascii="Calibri" w:eastAsia="Calibri" w:hAnsi="Calibri" w:cs="Calibri"/>
-          <w:sz w:val="19"/>
-          <w:szCs w:val="19"/>
-        </w:rPr>
-        <w:t>, GoDaddy) and integrating embedded hardware (ESP32, NFC) with backend APIs for real-time data processing. Adaptable and self-driven, with a continuous focus on learning modern web technologies and best practices.</w:t>
+        <w:t xml:space="preserve">Full-Stack Developer and recent Information Technology graduate with hands-on, production experience building web, mobile, desktop, and IoT-integrated systems. Progressed from OJT intern to full-time IT Specialist within a single company after being absorbed for strong performance. Proficient in React, TypeScript, Node.js, and SQL/Supabase, with experience deploying live production applications (SSL/DNS configuration, Hostinger, GoDaddy) and integrating embedded hardware (ESP32, NFC) with backend APIs for real-time data processing. Adaptable and self-driven, with a continuous focus on learning modern web technologies and best practices.</w:t>
       </w:r>
     </w:p>
     <w:p>
@@ -176,7 +89,7 @@
         <w:pBdr>
           <w:bottom w:val="single" w:sz="8" w:space="4" w:color="1F2937"/>
         </w:pBdr>
-        <w:spacing w:before="130" w:after="60"/>
+        <w:spacing w:before="100" w:after="40"/>
       </w:pPr>
       <w:r>
         <w:rPr>
@@ -192,7 +105,7 @@
     </w:p>
     <w:p>
       <w:pPr>
-        <w:spacing w:after="30"/>
+        <w:spacing w:after="18"/>
       </w:pPr>
       <w:r>
         <w:rPr>
@@ -216,7 +129,7 @@
     </w:p>
     <w:p>
       <w:pPr>
-        <w:spacing w:after="30"/>
+        <w:spacing w:after="18"/>
       </w:pPr>
       <w:r>
         <w:rPr>
@@ -235,30 +148,12 @@
           <w:sz w:val="19"/>
           <w:szCs w:val="19"/>
         </w:rPr>
-        <w:t xml:space="preserve">Node.js, SQL, </w:t>
-      </w:r>
-      <w:proofErr w:type="spellStart"/>
-      <w:r>
-        <w:rPr>
-          <w:rFonts w:ascii="Calibri" w:eastAsia="Calibri" w:hAnsi="Calibri" w:cs="Calibri"/>
-          <w:sz w:val="19"/>
-          <w:szCs w:val="19"/>
-        </w:rPr>
-        <w:t>Supabase</w:t>
-      </w:r>
-      <w:proofErr w:type="spellEnd"/>
-      <w:r>
-        <w:rPr>
-          <w:rFonts w:ascii="Calibri" w:eastAsia="Calibri" w:hAnsi="Calibri" w:cs="Calibri"/>
-          <w:sz w:val="19"/>
-          <w:szCs w:val="19"/>
-        </w:rPr>
-        <w:t>, Firebase</w:t>
-      </w:r>
-    </w:p>
-    <w:p>
-      <w:pPr>
-        <w:spacing w:after="30"/>
+        <w:t xml:space="preserve">Node.js, SQL, Supabase, Firebase</w:t>
+      </w:r>
+    </w:p>
+    <w:p>
+      <w:pPr>
+        <w:spacing w:after="18"/>
       </w:pPr>
       <w:r>
         <w:rPr>
@@ -282,7 +177,7 @@
     </w:p>
     <w:p>
       <w:pPr>
-        <w:spacing w:after="30"/>
+        <w:spacing w:after="18"/>
       </w:pPr>
       <w:r>
         <w:rPr>
@@ -301,22 +196,12 @@
           <w:sz w:val="19"/>
           <w:szCs w:val="19"/>
         </w:rPr>
-        <w:t xml:space="preserve">Internet of Things (IoT), </w:t>
-      </w:r>
-      <w:proofErr w:type="spellStart"/>
-      <w:r>
-        <w:rPr>
-          <w:rFonts w:ascii="Calibri" w:eastAsia="Calibri" w:hAnsi="Calibri" w:cs="Calibri"/>
-          <w:sz w:val="19"/>
-          <w:szCs w:val="19"/>
-        </w:rPr>
-        <w:t>PlatformIO</w:t>
-      </w:r>
-      <w:proofErr w:type="spellEnd"/>
-    </w:p>
-    <w:p>
-      <w:pPr>
-        <w:spacing w:after="30"/>
+        <w:t xml:space="preserve">Internet of Things (IoT), PlatformIO</w:t>
+      </w:r>
+    </w:p>
+    <w:p>
+      <w:pPr>
+        <w:spacing w:after="18"/>
       </w:pPr>
       <w:r>
         <w:rPr>
@@ -340,7 +225,7 @@
     </w:p>
     <w:p>
       <w:pPr>
-        <w:spacing w:after="30"/>
+        <w:spacing w:after="18"/>
       </w:pPr>
       <w:r>
         <w:rPr>
@@ -367,7 +252,7 @@
         <w:pBdr>
           <w:bottom w:val="single" w:sz="8" w:space="4" w:color="1F2937"/>
         </w:pBdr>
-        <w:spacing w:before="130" w:after="60"/>
+        <w:spacing w:before="100" w:after="40"/>
       </w:pPr>
       <w:r>
         <w:rPr>
@@ -448,7 +333,7 @@
           <w:ilvl w:val="0"/>
           <w:numId w:val="2"/>
         </w:numPr>
-        <w:spacing w:after="30" w:line="230" w:lineRule="auto"/>
+        <w:spacing w:after="18" w:line="215" w:lineRule="auto"/>
       </w:pPr>
       <w:r>
         <w:rPr>
@@ -466,7 +351,7 @@
           <w:ilvl w:val="0"/>
           <w:numId w:val="2"/>
         </w:numPr>
-        <w:spacing w:after="30" w:line="230" w:lineRule="auto"/>
+        <w:spacing w:after="18" w:line="215" w:lineRule="auto"/>
       </w:pPr>
       <w:r>
         <w:rPr>
@@ -484,7 +369,7 @@
           <w:ilvl w:val="0"/>
           <w:numId w:val="2"/>
         </w:numPr>
-        <w:spacing w:after="30" w:line="230" w:lineRule="auto"/>
+        <w:spacing w:after="18" w:line="215" w:lineRule="auto"/>
       </w:pPr>
       <w:r>
         <w:rPr>
@@ -502,7 +387,7 @@
           <w:ilvl w:val="0"/>
           <w:numId w:val="2"/>
         </w:numPr>
-        <w:spacing w:after="30" w:line="230" w:lineRule="auto"/>
+        <w:spacing w:after="18" w:line="215" w:lineRule="auto"/>
       </w:pPr>
       <w:r>
         <w:rPr>
@@ -549,7 +434,7 @@
           <w:ilvl w:val="0"/>
           <w:numId w:val="2"/>
         </w:numPr>
-        <w:spacing w:after="30" w:line="230" w:lineRule="auto"/>
+        <w:spacing w:after="18" w:line="215" w:lineRule="auto"/>
       </w:pPr>
       <w:r>
         <w:rPr>
@@ -567,7 +452,7 @@
           <w:ilvl w:val="0"/>
           <w:numId w:val="2"/>
         </w:numPr>
-        <w:spacing w:after="30" w:line="230" w:lineRule="auto"/>
+        <w:spacing w:after="18" w:line="215" w:lineRule="auto"/>
       </w:pPr>
       <w:r>
         <w:rPr>
@@ -585,7 +470,7 @@
           <w:ilvl w:val="0"/>
           <w:numId w:val="2"/>
         </w:numPr>
-        <w:spacing w:after="30" w:line="230" w:lineRule="auto"/>
+        <w:spacing w:after="18" w:line="215" w:lineRule="auto"/>
       </w:pPr>
       <w:r>
         <w:rPr>
@@ -601,7 +486,7 @@
         <w:pBdr>
           <w:bottom w:val="single" w:sz="8" w:space="4" w:color="1F2937"/>
         </w:pBdr>
-        <w:spacing w:before="130" w:after="60"/>
+        <w:spacing w:before="100" w:after="40"/>
       </w:pPr>
       <w:r>
         <w:rPr>
@@ -669,7 +554,7 @@
           <w:ilvl w:val="0"/>
           <w:numId w:val="2"/>
         </w:numPr>
-        <w:spacing w:after="30" w:line="230" w:lineRule="auto"/>
+        <w:spacing w:after="18" w:line="215" w:lineRule="auto"/>
       </w:pPr>
       <w:r>
         <w:rPr>
@@ -687,7 +572,7 @@
           <w:ilvl w:val="0"/>
           <w:numId w:val="2"/>
         </w:numPr>
-        <w:spacing w:after="30" w:line="230" w:lineRule="auto"/>
+        <w:spacing w:after="18" w:line="215" w:lineRule="auto"/>
       </w:pPr>
       <w:r>
         <w:rPr>
@@ -705,7 +590,7 @@
           <w:ilvl w:val="0"/>
           <w:numId w:val="2"/>
         </w:numPr>
-        <w:spacing w:after="30" w:line="230" w:lineRule="auto"/>
+        <w:spacing w:after="18" w:line="215" w:lineRule="auto"/>
       </w:pPr>
       <w:r>
         <w:rPr>
@@ -723,7 +608,7 @@
           <w:ilvl w:val="0"/>
           <w:numId w:val="2"/>
         </w:numPr>
-        <w:spacing w:after="30" w:line="230" w:lineRule="auto"/>
+        <w:spacing w:after="18" w:line="215" w:lineRule="auto"/>
       </w:pPr>
       <w:r>
         <w:rPr>
@@ -741,7 +626,7 @@
           <w:ilvl w:val="0"/>
           <w:numId w:val="2"/>
         </w:numPr>
-        <w:spacing w:after="30" w:line="230" w:lineRule="auto"/>
+        <w:spacing w:after="18" w:line="215" w:lineRule="auto"/>
       </w:pPr>
       <w:r>
         <w:rPr>
@@ -790,7 +675,7 @@
           <w:ilvl w:val="0"/>
           <w:numId w:val="2"/>
         </w:numPr>
-        <w:spacing w:after="30" w:line="230" w:lineRule="auto"/>
+        <w:spacing w:after="18" w:line="215" w:lineRule="auto"/>
       </w:pPr>
       <w:r>
         <w:rPr>
@@ -808,7 +693,7 @@
           <w:ilvl w:val="0"/>
           <w:numId w:val="2"/>
         </w:numPr>
-        <w:spacing w:after="30" w:line="230" w:lineRule="auto"/>
+        <w:spacing w:after="18" w:line="215" w:lineRule="auto"/>
       </w:pPr>
       <w:r>
         <w:rPr>
@@ -826,7 +711,7 @@
           <w:ilvl w:val="0"/>
           <w:numId w:val="2"/>
         </w:numPr>
-        <w:spacing w:after="30" w:line="230" w:lineRule="auto"/>
+        <w:spacing w:after="18" w:line="215" w:lineRule="auto"/>
       </w:pPr>
       <w:r>
         <w:rPr>
@@ -845,7 +730,7 @@
           <w:ilvl w:val="0"/>
           <w:numId w:val="2"/>
         </w:numPr>
-        <w:spacing w:after="30" w:line="230" w:lineRule="auto"/>
+        <w:spacing w:after="18" w:line="215" w:lineRule="auto"/>
       </w:pPr>
       <w:r>
         <w:rPr>
@@ -863,7 +748,7 @@
           <w:ilvl w:val="0"/>
           <w:numId w:val="2"/>
         </w:numPr>
-        <w:spacing w:after="30" w:line="230" w:lineRule="auto"/>
+        <w:spacing w:after="18" w:line="215" w:lineRule="auto"/>
       </w:pPr>
       <w:r>
         <w:rPr>
@@ -879,7 +764,7 @@
         <w:pBdr>
           <w:bottom w:val="single" w:sz="8" w:space="4" w:color="1F2937"/>
         </w:pBdr>
-        <w:spacing w:before="130" w:after="60"/>
+        <w:spacing w:before="100" w:after="40"/>
       </w:pPr>
       <w:r>
         <w:rPr>
@@ -947,7 +832,7 @@
           <w:ilvl w:val="0"/>
           <w:numId w:val="2"/>
         </w:numPr>
-        <w:spacing w:after="30" w:line="230" w:lineRule="auto"/>
+        <w:spacing w:after="18" w:line="215" w:lineRule="auto"/>
       </w:pPr>
       <w:r>
         <w:rPr>
@@ -965,7 +850,7 @@
           <w:ilvl w:val="0"/>
           <w:numId w:val="2"/>
         </w:numPr>
-        <w:spacing w:after="30" w:line="230" w:lineRule="auto"/>
+        <w:spacing w:after="18" w:line="215" w:lineRule="auto"/>
       </w:pPr>
       <w:r>
         <w:rPr>
@@ -983,7 +868,7 @@
           <w:ilvl w:val="0"/>
           <w:numId w:val="2"/>
         </w:numPr>
-        <w:spacing w:after="30" w:line="230" w:lineRule="auto"/>
+        <w:spacing w:after="18" w:line="215" w:lineRule="auto"/>
       </w:pPr>
       <w:r>
         <w:rPr>
@@ -1001,7 +886,7 @@
           <w:ilvl w:val="0"/>
           <w:numId w:val="2"/>
         </w:numPr>
-        <w:spacing w:after="30" w:line="230" w:lineRule="auto"/>
+        <w:spacing w:after="18" w:line="215" w:lineRule="auto"/>
       </w:pPr>
       <w:r>
         <w:rPr>
@@ -1019,7 +904,7 @@
           <w:ilvl w:val="0"/>
           <w:numId w:val="2"/>
         </w:numPr>
-        <w:spacing w:after="30" w:line="230" w:lineRule="auto"/>
+        <w:spacing w:after="18" w:line="215" w:lineRule="auto"/>
       </w:pPr>
       <w:r>
         <w:rPr>
@@ -1068,43 +953,25 @@
           <w:ilvl w:val="0"/>
           <w:numId w:val="2"/>
         </w:numPr>
-        <w:spacing w:after="30" w:line="230" w:lineRule="auto"/>
-      </w:pPr>
-      <w:r>
-        <w:rPr>
-          <w:rFonts w:ascii="Calibri" w:eastAsia="Calibri" w:hAnsi="Calibri" w:cs="Calibri"/>
-          <w:sz w:val="19"/>
-          <w:szCs w:val="19"/>
-        </w:rPr>
-        <w:t xml:space="preserve">Developed a fully responsive </w:t>
-      </w:r>
-      <w:proofErr w:type="gramStart"/>
-      <w:r>
-        <w:rPr>
-          <w:rFonts w:ascii="Calibri" w:eastAsia="Calibri" w:hAnsi="Calibri" w:cs="Calibri"/>
-          <w:sz w:val="19"/>
-          <w:szCs w:val="19"/>
-        </w:rPr>
-        <w:t>single-page</w:t>
-      </w:r>
-      <w:proofErr w:type="gramEnd"/>
-      <w:r>
-        <w:rPr>
-          <w:rFonts w:ascii="Calibri" w:eastAsia="Calibri" w:hAnsi="Calibri" w:cs="Calibri"/>
-          <w:sz w:val="19"/>
-          <w:szCs w:val="19"/>
-        </w:rPr>
-        <w:t xml:space="preserve"> React application for a resort booking platform.</w:t>
-      </w:r>
-    </w:p>
-    <w:p>
-      <w:pPr>
-        <w:pStyle w:val="ListParagraph"/>
-        <w:numPr>
-          <w:ilvl w:val="0"/>
-          <w:numId w:val="2"/>
-        </w:numPr>
-        <w:spacing w:after="30" w:line="230" w:lineRule="auto"/>
+        <w:spacing w:after="18" w:line="215" w:lineRule="auto"/>
+      </w:pPr>
+      <w:r>
+        <w:rPr>
+          <w:rFonts w:ascii="Calibri" w:eastAsia="Calibri" w:hAnsi="Calibri" w:cs="Calibri"/>
+          <w:sz w:val="19"/>
+          <w:szCs w:val="19"/>
+        </w:rPr>
+        <w:t xml:space="preserve">Developed a fully responsive single-page React application for a resort booking platform.</w:t>
+      </w:r>
+    </w:p>
+    <w:p>
+      <w:pPr>
+        <w:pStyle w:val="ListParagraph"/>
+        <w:numPr>
+          <w:ilvl w:val="0"/>
+          <w:numId w:val="2"/>
+        </w:numPr>
+        <w:spacing w:after="18" w:line="215" w:lineRule="auto"/>
       </w:pPr>
       <w:r>
         <w:rPr>
@@ -1122,7 +989,7 @@
           <w:ilvl w:val="0"/>
           <w:numId w:val="2"/>
         </w:numPr>
-        <w:spacing w:after="30" w:line="230" w:lineRule="auto"/>
+        <w:spacing w:after="18" w:line="215" w:lineRule="auto"/>
       </w:pPr>
       <w:r>
         <w:rPr>
@@ -1140,43 +1007,25 @@
           <w:ilvl w:val="0"/>
           <w:numId w:val="2"/>
         </w:numPr>
-        <w:spacing w:after="30" w:line="230" w:lineRule="auto"/>
-      </w:pPr>
-      <w:r>
-        <w:rPr>
-          <w:rFonts w:ascii="Calibri" w:eastAsia="Calibri" w:hAnsi="Calibri" w:cs="Calibri"/>
-          <w:sz w:val="19"/>
-          <w:szCs w:val="19"/>
-        </w:rPr>
-        <w:t xml:space="preserve">Built </w:t>
-      </w:r>
-      <w:proofErr w:type="gramStart"/>
-      <w:r>
-        <w:rPr>
-          <w:rFonts w:ascii="Calibri" w:eastAsia="Calibri" w:hAnsi="Calibri" w:cs="Calibri"/>
-          <w:sz w:val="19"/>
-          <w:szCs w:val="19"/>
-        </w:rPr>
-        <w:t>an interactive accommodations</w:t>
-      </w:r>
-      <w:proofErr w:type="gramEnd"/>
-      <w:r>
-        <w:rPr>
-          <w:rFonts w:ascii="Calibri" w:eastAsia="Calibri" w:hAnsi="Calibri" w:cs="Calibri"/>
-          <w:sz w:val="19"/>
-          <w:szCs w:val="19"/>
-        </w:rPr>
-        <w:t xml:space="preserve"> showcase with hover details, an amenities grid, and an animated testimonials gallery with lightbox.</w:t>
-      </w:r>
-    </w:p>
-    <w:p>
-      <w:pPr>
-        <w:pStyle w:val="ListParagraph"/>
-        <w:numPr>
-          <w:ilvl w:val="0"/>
-          <w:numId w:val="2"/>
-        </w:numPr>
-        <w:spacing w:after="30" w:line="230" w:lineRule="auto"/>
+        <w:spacing w:after="18" w:line="215" w:lineRule="auto"/>
+      </w:pPr>
+      <w:r>
+        <w:rPr>
+          <w:rFonts w:ascii="Calibri" w:eastAsia="Calibri" w:hAnsi="Calibri" w:cs="Calibri"/>
+          <w:sz w:val="19"/>
+          <w:szCs w:val="19"/>
+        </w:rPr>
+        <w:t xml:space="preserve">Built an interactive accommodations showcase with hover details, an amenities grid, and an animated testimonials gallery with lightbox.</w:t>
+      </w:r>
+    </w:p>
+    <w:p>
+      <w:pPr>
+        <w:pStyle w:val="ListParagraph"/>
+        <w:numPr>
+          <w:ilvl w:val="0"/>
+          <w:numId w:val="2"/>
+        </w:numPr>
+        <w:spacing w:after="18" w:line="215" w:lineRule="auto"/>
       </w:pPr>
       <w:r>
         <w:rPr>
@@ -1225,7 +1074,7 @@
           <w:ilvl w:val="0"/>
           <w:numId w:val="2"/>
         </w:numPr>
-        <w:spacing w:after="30" w:line="230" w:lineRule="auto"/>
+        <w:spacing w:after="18" w:line="215" w:lineRule="auto"/>
       </w:pPr>
       <w:r>
         <w:rPr>
@@ -1243,7 +1092,7 @@
           <w:ilvl w:val="0"/>
           <w:numId w:val="2"/>
         </w:numPr>
-        <w:spacing w:after="30" w:line="230" w:lineRule="auto"/>
+        <w:spacing w:after="18" w:line="215" w:lineRule="auto"/>
       </w:pPr>
       <w:r>
         <w:rPr>
@@ -1261,7 +1110,7 @@
           <w:ilvl w:val="0"/>
           <w:numId w:val="2"/>
         </w:numPr>
-        <w:spacing w:after="30" w:line="230" w:lineRule="auto"/>
+        <w:spacing w:after="18" w:line="215" w:lineRule="auto"/>
       </w:pPr>
       <w:r>
         <w:rPr>
@@ -1279,7 +1128,7 @@
           <w:ilvl w:val="0"/>
           <w:numId w:val="2"/>
         </w:numPr>
-        <w:spacing w:after="30" w:line="230" w:lineRule="auto"/>
+        <w:spacing w:after="18" w:line="215" w:lineRule="auto"/>
       </w:pPr>
       <w:r>
         <w:rPr>
@@ -1297,7 +1146,7 @@
           <w:ilvl w:val="0"/>
           <w:numId w:val="2"/>
         </w:numPr>
-        <w:spacing w:after="30" w:line="230" w:lineRule="auto"/>
+        <w:spacing w:after="18" w:line="215" w:lineRule="auto"/>
       </w:pPr>
       <w:r>
         <w:rPr>
@@ -1346,7 +1195,7 @@
           <w:ilvl w:val="0"/>
           <w:numId w:val="2"/>
         </w:numPr>
-        <w:spacing w:after="30" w:line="230" w:lineRule="auto"/>
+        <w:spacing w:after="18" w:line="215" w:lineRule="auto"/>
       </w:pPr>
       <w:r>
         <w:rPr>
@@ -1364,7 +1213,7 @@
           <w:ilvl w:val="0"/>
           <w:numId w:val="2"/>
         </w:numPr>
-        <w:spacing w:after="30" w:line="230" w:lineRule="auto"/>
+        <w:spacing w:after="18" w:line="215" w:lineRule="auto"/>
       </w:pPr>
       <w:r>
         <w:rPr>
@@ -1382,7 +1231,7 @@
           <w:ilvl w:val="0"/>
           <w:numId w:val="2"/>
         </w:numPr>
-        <w:spacing w:after="30" w:line="230" w:lineRule="auto"/>
+        <w:spacing w:after="18" w:line="215" w:lineRule="auto"/>
       </w:pPr>
       <w:r>
         <w:rPr>
@@ -1400,7 +1249,7 @@
           <w:ilvl w:val="0"/>
           <w:numId w:val="2"/>
         </w:numPr>
-        <w:spacing w:after="30" w:line="230" w:lineRule="auto"/>
+        <w:spacing w:after="18" w:line="215" w:lineRule="auto"/>
       </w:pPr>
       <w:r>
         <w:rPr>
@@ -1418,7 +1267,7 @@
           <w:ilvl w:val="0"/>
           <w:numId w:val="2"/>
         </w:numPr>
-        <w:spacing w:after="30" w:line="230" w:lineRule="auto"/>
+        <w:spacing w:after="18" w:line="215" w:lineRule="auto"/>
       </w:pPr>
       <w:r>
         <w:rPr>
@@ -1467,133 +1316,61 @@
           <w:ilvl w:val="0"/>
           <w:numId w:val="2"/>
         </w:numPr>
-        <w:spacing w:after="30" w:line="230" w:lineRule="auto"/>
-      </w:pPr>
-      <w:r>
-        <w:rPr>
-          <w:rFonts w:ascii="Calibri" w:eastAsia="Calibri" w:hAnsi="Calibri" w:cs="Calibri"/>
-          <w:sz w:val="19"/>
-          <w:szCs w:val="19"/>
-        </w:rPr>
-        <w:t xml:space="preserve">Built a full-stack inventory management application using React, Vite, and </w:t>
-      </w:r>
-      <w:proofErr w:type="spellStart"/>
-      <w:r>
-        <w:rPr>
-          <w:rFonts w:ascii="Calibri" w:eastAsia="Calibri" w:hAnsi="Calibri" w:cs="Calibri"/>
-          <w:sz w:val="19"/>
-          <w:szCs w:val="19"/>
-        </w:rPr>
-        <w:t>TailwindCSS</w:t>
-      </w:r>
-      <w:proofErr w:type="spellEnd"/>
-      <w:r>
-        <w:rPr>
-          <w:rFonts w:ascii="Calibri" w:eastAsia="Calibri" w:hAnsi="Calibri" w:cs="Calibri"/>
-          <w:sz w:val="19"/>
-          <w:szCs w:val="19"/>
-        </w:rPr>
-        <w:t xml:space="preserve"> with a </w:t>
-      </w:r>
-      <w:proofErr w:type="spellStart"/>
-      <w:r>
-        <w:rPr>
-          <w:rFonts w:ascii="Calibri" w:eastAsia="Calibri" w:hAnsi="Calibri" w:cs="Calibri"/>
-          <w:sz w:val="19"/>
-          <w:szCs w:val="19"/>
-        </w:rPr>
-        <w:t>Supabase</w:t>
-      </w:r>
-      <w:proofErr w:type="spellEnd"/>
-      <w:r>
-        <w:rPr>
-          <w:rFonts w:ascii="Calibri" w:eastAsia="Calibri" w:hAnsi="Calibri" w:cs="Calibri"/>
-          <w:sz w:val="19"/>
-          <w:szCs w:val="19"/>
-        </w:rPr>
-        <w:t xml:space="preserve"> (PostgreSQL) backend for centralized, secure data management.</w:t>
-      </w:r>
-    </w:p>
-    <w:p>
-      <w:pPr>
-        <w:pStyle w:val="ListParagraph"/>
-        <w:numPr>
-          <w:ilvl w:val="0"/>
-          <w:numId w:val="2"/>
-        </w:numPr>
-        <w:spacing w:after="30" w:line="230" w:lineRule="auto"/>
-      </w:pPr>
-      <w:r>
-        <w:rPr>
-          <w:rFonts w:ascii="Calibri" w:eastAsia="Calibri" w:hAnsi="Calibri" w:cs="Calibri"/>
-          <w:sz w:val="19"/>
-          <w:szCs w:val="19"/>
-        </w:rPr>
-        <w:t xml:space="preserve">Implemented offline-first functionality using Service Workers and </w:t>
-      </w:r>
-      <w:proofErr w:type="spellStart"/>
-      <w:r>
-        <w:rPr>
-          <w:rFonts w:ascii="Calibri" w:eastAsia="Calibri" w:hAnsi="Calibri" w:cs="Calibri"/>
-          <w:sz w:val="19"/>
-          <w:szCs w:val="19"/>
-        </w:rPr>
-        <w:t>IndexedDB</w:t>
-      </w:r>
-      <w:proofErr w:type="spellEnd"/>
-      <w:r>
-        <w:rPr>
-          <w:rFonts w:ascii="Calibri" w:eastAsia="Calibri" w:hAnsi="Calibri" w:cs="Calibri"/>
-          <w:sz w:val="19"/>
-          <w:szCs w:val="19"/>
-        </w:rPr>
-        <w:t>, enabling uninterrupted stock scanning and purchase order creation with automatic sync on reconnect.</w:t>
-      </w:r>
-    </w:p>
-    <w:p>
-      <w:pPr>
-        <w:pStyle w:val="ListParagraph"/>
-        <w:numPr>
-          <w:ilvl w:val="0"/>
-          <w:numId w:val="2"/>
-        </w:numPr>
-        <w:spacing w:after="30" w:line="230" w:lineRule="auto"/>
-      </w:pPr>
-      <w:r>
-        <w:rPr>
-          <w:rFonts w:ascii="Calibri" w:eastAsia="Calibri" w:hAnsi="Calibri" w:cs="Calibri"/>
-          <w:sz w:val="19"/>
-          <w:szCs w:val="19"/>
-        </w:rPr>
-        <w:t xml:space="preserve">Built a real-time synced dashboard with Recharts, using </w:t>
-      </w:r>
-      <w:proofErr w:type="spellStart"/>
-      <w:r>
-        <w:rPr>
-          <w:rFonts w:ascii="Calibri" w:eastAsia="Calibri" w:hAnsi="Calibri" w:cs="Calibri"/>
-          <w:sz w:val="19"/>
-          <w:szCs w:val="19"/>
-        </w:rPr>
-        <w:t>Supabase</w:t>
-      </w:r>
-      <w:proofErr w:type="spellEnd"/>
-      <w:r>
-        <w:rPr>
-          <w:rFonts w:ascii="Calibri" w:eastAsia="Calibri" w:hAnsi="Calibri" w:cs="Calibri"/>
-          <w:sz w:val="19"/>
-          <w:szCs w:val="19"/>
-        </w:rPr>
-        <w:t xml:space="preserve"> real-time subscriptions to keep stock levels and alerts updated across all active sessions.</w:t>
-      </w:r>
-    </w:p>
-    <w:p>
-      <w:pPr>
-        <w:pStyle w:val="ListParagraph"/>
-        <w:numPr>
-          <w:ilvl w:val="0"/>
-          <w:numId w:val="2"/>
-        </w:numPr>
-        <w:spacing w:after="30" w:line="230" w:lineRule="auto"/>
+        <w:spacing w:after="18" w:line="215" w:lineRule="auto"/>
+      </w:pPr>
+      <w:r>
+        <w:rPr>
+          <w:rFonts w:ascii="Calibri" w:eastAsia="Calibri" w:hAnsi="Calibri" w:cs="Calibri"/>
+          <w:sz w:val="19"/>
+          <w:szCs w:val="19"/>
+        </w:rPr>
+        <w:t xml:space="preserve">Built a full-stack inventory management application using React, Vite, and TailwindCSS with a Supabase (PostgreSQL) backend for centralized, secure data management.</w:t>
+      </w:r>
+    </w:p>
+    <w:p>
+      <w:pPr>
+        <w:pStyle w:val="ListParagraph"/>
+        <w:numPr>
+          <w:ilvl w:val="0"/>
+          <w:numId w:val="2"/>
+        </w:numPr>
+        <w:spacing w:after="18" w:line="215" w:lineRule="auto"/>
+      </w:pPr>
+      <w:r>
+        <w:rPr>
+          <w:rFonts w:ascii="Calibri" w:eastAsia="Calibri" w:hAnsi="Calibri" w:cs="Calibri"/>
+          <w:sz w:val="19"/>
+          <w:szCs w:val="19"/>
+        </w:rPr>
+        <w:t xml:space="preserve">Implemented offline-first functionality using Service Workers and IndexedDB, enabling uninterrupted stock scanning and purchase order creation with automatic sync on reconnect.</w:t>
+      </w:r>
+    </w:p>
+    <w:p>
+      <w:pPr>
+        <w:pStyle w:val="ListParagraph"/>
+        <w:numPr>
+          <w:ilvl w:val="0"/>
+          <w:numId w:val="2"/>
+        </w:numPr>
+        <w:spacing w:after="18" w:line="215" w:lineRule="auto"/>
+      </w:pPr>
+      <w:r>
+        <w:rPr>
+          <w:rFonts w:ascii="Calibri" w:eastAsia="Calibri" w:hAnsi="Calibri" w:cs="Calibri"/>
+          <w:sz w:val="19"/>
+          <w:szCs w:val="19"/>
+        </w:rPr>
+        <w:t xml:space="preserve">Built a real-time synced dashboard with Recharts, using Supabase real-time subscriptions to keep stock levels and alerts updated across all active sessions.</w:t>
+      </w:r>
+    </w:p>
+    <w:p>
+      <w:pPr>
+        <w:pStyle w:val="ListParagraph"/>
+        <w:numPr>
+          <w:ilvl w:val="0"/>
+          <w:numId w:val="2"/>
+        </w:numPr>
+        <w:spacing w:after="18" w:line="215" w:lineRule="auto"/>
       </w:pPr>
       <w:r>
         <w:rPr>
@@ -1602,6 +1379,127 @@
           <w:szCs w:val="19"/>
         </w:rPr>
         <w:t>Implemented multi-role access control (Admin, Manager, Staff) with Row Level Security (RLS), audit trails, automated purchase order generation, and CSV reporting.</w:t>
+      </w:r>
+    </w:p>
+    <w:p>
+      <w:pPr>
+        <w:tabs>
+          <w:tab w:val="right" w:pos="9360"/>
+        </w:tabs>
+        <w:spacing w:before="80" w:after="8"/>
+      </w:pPr>
+      <w:r>
+        <w:rPr>
+          <w:rFonts w:ascii="Calibri" w:eastAsia="Calibri" w:hAnsi="Calibri" w:cs="Calibri"/>
+          <w:b/>
+          <w:bCs/>
+          <w:color w:val="1F2937"/>
+          <w:sz w:val="21"/>
+          <w:szCs w:val="21"/>
+        </w:rPr>
+        <w:t>Let's Play Song</w:t>
+      </w:r>
+      <w:r>
+        <w:rPr>
+          <w:rFonts w:ascii="Calibri" w:eastAsia="Calibri" w:hAnsi="Calibri" w:cs="Calibri"/>
+          <w:i/>
+          <w:iCs/>
+          <w:color w:val="4B5563"/>
+          <w:sz w:val="19"/>
+          <w:szCs w:val="19"/>
+        </w:rPr>
+        <w:tab/>
+        <w:t>Philippines</w:t>
+      </w:r>
+    </w:p>
+    <w:p>
+      <w:pPr>
+        <w:pStyle w:val="ListParagraph"/>
+        <w:numPr>
+          <w:ilvl w:val="0"/>
+          <w:numId w:val="2"/>
+        </w:numPr>
+        <w:spacing w:after="18" w:line="215" w:lineRule="auto"/>
+      </w:pPr>
+      <w:r>
+        <w:rPr>
+          <w:rFonts w:ascii="Calibri" w:eastAsia="Calibri" w:hAnsi="Calibri" w:cs="Calibri"/>
+          <w:sz w:val="19"/>
+          <w:szCs w:val="19"/>
+        </w:rPr>
+        <w:t>Built a music player app for phones (iPhone and Android) that lets people stream and listen to songs anywhere, with a simple, easy-to-use design.</w:t>
+      </w:r>
+    </w:p>
+    <w:p>
+      <w:pPr>
+        <w:pStyle w:val="ListParagraph"/>
+        <w:numPr>
+          <w:ilvl w:val="0"/>
+          <w:numId w:val="2"/>
+        </w:numPr>
+        <w:spacing w:after="18" w:line="215" w:lineRule="auto"/>
+      </w:pPr>
+      <w:r>
+        <w:rPr>
+          <w:rFonts w:ascii="Calibri" w:eastAsia="Calibri" w:hAnsi="Calibri" w:cs="Calibri"/>
+          <w:sz w:val="19"/>
+          <w:szCs w:val="19"/>
+        </w:rPr>
+        <w:t>Added the option to sign in with an email or a Google account, so each person's playlists and saved songs stay tied to their own account.</w:t>
+      </w:r>
+    </w:p>
+    <w:p>
+      <w:pPr>
+        <w:pStyle w:val="ListParagraph"/>
+        <w:numPr>
+          <w:ilvl w:val="0"/>
+          <w:numId w:val="2"/>
+        </w:numPr>
+        <w:spacing w:after="18" w:line="215" w:lineRule="auto"/>
+      </w:pPr>
+      <w:r>
+        <w:rPr>
+          <w:rFonts w:ascii="Calibri" w:eastAsia="Calibri" w:hAnsi="Calibri" w:cs="Calibri"/>
+          <w:sz w:val="19"/>
+          <w:szCs w:val="19"/>
+        </w:rPr>
+        <w:t>Made it possible to create playlists that automatically stay up to date on every device, so a playlist saved on one phone shows up the same way on another.</w:t>
+      </w:r>
+    </w:p>
+    <w:p>
+      <w:pPr>
+        <w:pStyle w:val="ListParagraph"/>
+        <w:numPr>
+          <w:ilvl w:val="0"/>
+          <w:numId w:val="2"/>
+        </w:numPr>
+        <w:spacing w:after="18" w:line="215" w:lineRule="auto"/>
+      </w:pPr>
+      <w:r>
+        <w:rPr>
+          <w:rFonts w:ascii="Calibri" w:eastAsia="Calibri" w:hAnsi="Calibri" w:cs="Calibri"/>
+          <w:sz w:val="19"/>
+          <w:szCs w:val="19"/>
+        </w:rPr>
+        <w:t>Added a built-in sound equalizer so listeners can adjust the audio to their own taste, like boosting the bass or making vocals clearer.</w:t>
+      </w:r>
+    </w:p>
+    <w:p>
+      <w:pPr>
+        <w:pStyle w:val="ListParagraph"/>
+        <w:numPr>
+          <w:ilvl w:val="0"/>
+          <w:numId w:val="2"/>
+        </w:numPr>
+        <w:spacing w:after="18" w:line="215" w:lineRule="auto"/>
+      </w:pPr>
+      <w:r>
+        <w:rPr>
+          <w:rFonts w:ascii="Calibri" w:eastAsia="Calibri" w:hAnsi="Calibri" w:cs="Calibri"/>
+          <w:sz w:val="19"/>
+          <w:szCs w:val="19"/>
+        </w:rPr>
+        <w:t>Built a "download for offline" option so users can save their favorite songs directly on their phone and keep listening even without an internet connection.</w:t>
       </w:r>
     </w:p>
     <w:p>
@@ -1609,7 +1507,7 @@
         <w:pBdr>
           <w:bottom w:val="single" w:sz="8" w:space="4" w:color="1F2937"/>
         </w:pBdr>
-        <w:spacing w:before="130" w:after="60"/>
+        <w:spacing w:before="100" w:after="40"/>
       </w:pPr>
       <w:r>
         <w:rPr>
@@ -1717,7 +1615,7 @@
     </w:p>
     <w:sectPr>
       <w:pgSz w:w="12240" w:h="15840"/>
-      <w:pgMar w:top="460" w:right="810" w:bottom="460" w:left="810" w:header="708" w:footer="708" w:gutter="0"/>
+      <w:pgMar w:top="380" w:right="810" w:bottom="380" w:left="810" w:header="708" w:footer="708" w:gutter="0"/>
       <w:cols w:space="720"/>
       <w:docGrid w:linePitch="360"/>
     </w:sectPr>

</xml_diff>